<commit_message>
fixing MonthlyBudgetScreen.tsx dengan adding tombol back dan savearea, menghapus MontlyBudgetScreen2.tsx,
</commit_message>
<xml_diff>
--- a/mockups/brief.docx
+++ b/mockups/brief.docx
@@ -2,21 +2,6 @@
 <file path=word/document.xml><?xml version="1.0" encoding="utf-8"?>
 <w:document xmlns:wpc="http://schemas.microsoft.com/office/word/2010/wordprocessingCanvas" xmlns:cx="http://schemas.microsoft.com/office/drawing/2014/chartex" xmlns:cx1="http://schemas.microsoft.com/office/drawing/2015/9/8/chartex" xmlns:cx2="http://schemas.microsoft.com/office/drawing/2015/10/21/chartex" xmlns:cx3="http://schemas.microsoft.com/office/drawing/2016/5/9/chartex" xmlns:cx4="http://schemas.microsoft.com/office/drawing/2016/5/10/chartex" xmlns:cx5="http://schemas.microsoft.com/office/drawing/2016/5/11/chartex" xmlns:cx6="http://schemas.microsoft.com/office/drawing/2016/5/12/chartex" xmlns:cx7="http://schemas.microsoft.com/office/drawing/2016/5/13/chartex" xmlns:cx8="http://schemas.microsoft.com/office/drawing/2016/5/14/chartex" xmlns:mc="http://schemas.openxmlformats.org/markup-compatibility/2006" xmlns:aink="http://schemas.microsoft.com/office/drawing/2016/ink" xmlns:am3d="http://schemas.microsoft.com/office/drawing/2017/model3d" xmlns:o="urn:schemas-microsoft-com:office:office" xmlns:oel="http://schemas.microsoft.com/office/2019/extlst" xmlns:r="http://schemas.openxmlformats.org/officeDocument/2006/relationships" xmlns:m="http://schemas.openxmlformats.org/officeDocument/2006/math" xmlns:v="urn:schemas-microsoft-com:vml" xmlns:wp14="http://schemas.microsoft.com/office/word/2010/wordprocessingDrawing" xmlns:wp="http://schemas.openxmlformats.org/drawingml/2006/wordprocessingDrawing" xmlns:w10="urn:schemas-microsoft-com:office:word" xmlns:w="http://schemas.openxmlformats.org/wordprocessingml/2006/main" xmlns:w14="http://schemas.microsoft.com/office/word/2010/wordml" xmlns:w15="http://schemas.microsoft.com/office/word/2012/wordml" xmlns:w16cex="http://schemas.microsoft.com/office/word/2018/wordml/cex" xmlns:w16cid="http://schemas.microsoft.com/office/word/2016/wordml/cid" xmlns:w16="http://schemas.microsoft.com/office/word/2018/wordml" xmlns:w16sdtdh="http://schemas.microsoft.com/office/word/2020/wordml/sdtdatahash" xmlns:w16se="http://schemas.microsoft.com/office/word/2015/wordml/symex" xmlns:wpg="http://schemas.microsoft.com/office/word/2010/wordprocessingGroup" xmlns:wpi="http://schemas.microsoft.com/office/word/2010/wordprocessingInk" xmlns:wne="http://schemas.microsoft.com/office/word/2006/wordml" xmlns:wps="http://schemas.microsoft.com/office/word/2010/wordprocessingShape" mc:Ignorable="w14 w15 w16se w16cid w16 w16cex w16sdtdh wp14">
   <w:body>
-    <w:p>
-      <w:r>
-        <w:t>halo claude...</w:t>
-      </w:r>
-    </w:p>
-    <w:p>
-      <w:r>
-        <w:t>aku mau mencoba antigravity untuk membuat aplikasi... yang sebelumnya sempat trauma dengan platform IDE windsurf yang sempat aku ceritakan...</w:t>
-      </w:r>
-    </w:p>
-    <w:p>
-      <w:r>
-        <w:t>jadi kali ini aku mau membuat aplikasi simple sebelum aku membuat SaaS besar yang aku cerita untuk sekolah itu...</w:t>
-      </w:r>
-    </w:p>
     <w:p>
       <w:r>
         <w:t>jadi aplikasi yang mau aku buat adalah aplikasi pencatatan keuangan pribadi, tapi aplikasi ini akan dipakai bersamaan aku, istri dan bisa menambah user lain... dan sumber keuangan atau data pencatatan bisa terlihat untuk semua user karena yang menggunakan rencana hanya keluarga inti saja...hanya saja selain bisa menambah user, kami juga bisa menambahkan pekerjaan/sumber pemasukkan yang didalamnya ada pencatatan cash-flow nya sendiri...</w:t>
@@ -187,7 +172,6 @@
           </w:tcPr>
           <w:p>
             <w:r>
-              <w:lastRenderedPageBreak/>
               <w:t>Berbasis JavaScript/React</w:t>
             </w:r>
           </w:p>
@@ -310,13 +294,14 @@
     </w:p>
     <w:p>
       <w:r>
+        <w:lastRenderedPageBreak/>
         <w:t>Karena nanti SaaS sekolah kamu juga pakai Next.js, jadi skill-nya carry over.</w:t>
       </w:r>
     </w:p>
     <w:p>
       <w:r>
         <w:pict w14:anchorId="5DA7B735">
-          <v:rect id="_x0000_i1031" style="width:0;height:1.5pt" o:hralign="center" o:hrstd="t" o:hr="t" fillcolor="#a0a0a0" stroked="f"/>
+          <v:rect id="_x0000_i1025" style="width:0;height:1.5pt" o:hralign="center" o:hrstd="t" o:hr="t" fillcolor="#a0a0a0" stroked="f"/>
         </w:pict>
       </w:r>
     </w:p>
@@ -766,6 +751,9 @@
     <w:p/>
     <w:p>
       <w:r>
+        <w:rPr>
+          <w:noProof/>
+        </w:rPr>
         <w:lastRenderedPageBreak/>
         <w:drawing>
           <wp:inline distT="0" distB="0" distL="0" distR="0" wp14:anchorId="442F7495" wp14:editId="6B98448E">
@@ -836,7 +824,7 @@
     <w:p>
       <w:r>
         <w:pict w14:anchorId="2BC10D3E">
-          <v:rect id="_x0000_i1087" style="width:0;height:1.5pt" o:hralign="center" o:hrstd="t" o:hr="t" fillcolor="#a0a0a0" stroked="f"/>
+          <v:rect id="_x0000_i1026" style="width:0;height:1.5pt" o:hralign="center" o:hrstd="t" o:hr="t" fillcolor="#a0a0a0" stroked="f"/>
         </w:pict>
       </w:r>
     </w:p>
@@ -886,7 +874,7 @@
     <w:p>
       <w:r>
         <w:pict w14:anchorId="2825DE90">
-          <v:rect id="_x0000_i1088" style="width:0;height:1.5pt" o:hralign="center" o:hrstd="t" o:hr="t" fillcolor="#a0a0a0" stroked="f"/>
+          <v:rect id="_x0000_i1027" style="width:0;height:1.5pt" o:hralign="center" o:hrstd="t" o:hr="t" fillcolor="#a0a0a0" stroked="f"/>
         </w:pict>
       </w:r>
     </w:p>
@@ -1003,7 +991,7 @@
     <w:p>
       <w:r>
         <w:pict w14:anchorId="4FD80863">
-          <v:rect id="_x0000_i1089" style="width:0;height:1.5pt" o:hralign="center" o:hrstd="t" o:hr="t" fillcolor="#a0a0a0" stroked="f"/>
+          <v:rect id="_x0000_i1028" style="width:0;height:1.5pt" o:hralign="center" o:hrstd="t" o:hr="t" fillcolor="#a0a0a0" stroked="f"/>
         </w:pict>
       </w:r>
     </w:p>
@@ -1078,7 +1066,7 @@
     <w:p>
       <w:r>
         <w:pict w14:anchorId="2DC6A225">
-          <v:rect id="_x0000_i1090" style="width:0;height:1.5pt" o:hralign="center" o:hrstd="t" o:hr="t" fillcolor="#a0a0a0" stroked="f"/>
+          <v:rect id="_x0000_i1029" style="width:0;height:1.5pt" o:hralign="center" o:hrstd="t" o:hr="t" fillcolor="#a0a0a0" stroked="f"/>
         </w:pict>
       </w:r>
     </w:p>
@@ -1153,7 +1141,7 @@
     <w:p>
       <w:r>
         <w:pict w14:anchorId="384739A9">
-          <v:rect id="_x0000_i1091" style="width:0;height:1.5pt" o:hralign="center" o:hrstd="t" o:hr="t" fillcolor="#a0a0a0" stroked="f"/>
+          <v:rect id="_x0000_i1030" style="width:0;height:1.5pt" o:hralign="center" o:hrstd="t" o:hr="t" fillcolor="#a0a0a0" stroked="f"/>
         </w:pict>
       </w:r>
     </w:p>
@@ -1283,7 +1271,7 @@
     <w:p>
       <w:r>
         <w:pict w14:anchorId="1F7BE888">
-          <v:rect id="_x0000_i1092" style="width:0;height:1.5pt" o:hralign="center" o:hrstd="t" o:hr="t" fillcolor="#a0a0a0" stroked="f"/>
+          <v:rect id="_x0000_i1031" style="width:0;height:1.5pt" o:hralign="center" o:hrstd="t" o:hr="t" fillcolor="#a0a0a0" stroked="f"/>
         </w:pict>
       </w:r>
     </w:p>
@@ -1376,7 +1364,7 @@
     <w:p>
       <w:r>
         <w:pict w14:anchorId="6F945E9A">
-          <v:rect id="_x0000_i1093" style="width:0;height:1.5pt" o:hralign="center" o:hrstd="t" o:hr="t" fillcolor="#a0a0a0" stroked="f"/>
+          <v:rect id="_x0000_i1032" style="width:0;height:1.5pt" o:hralign="center" o:hrstd="t" o:hr="t" fillcolor="#a0a0a0" stroked="f"/>
         </w:pict>
       </w:r>
     </w:p>
@@ -1414,7 +1402,7 @@
     <w:p>
       <w:r>
         <w:pict w14:anchorId="29FE38CD">
-          <v:rect id="_x0000_i1094" style="width:0;height:1.5pt" o:hralign="center" o:hrstd="t" o:hr="t" fillcolor="#a0a0a0" stroked="f"/>
+          <v:rect id="_x0000_i1033" style="width:0;height:1.5pt" o:hralign="center" o:hrstd="t" o:hr="t" fillcolor="#a0a0a0" stroked="f"/>
         </w:pict>
       </w:r>
     </w:p>
@@ -1642,7 +1630,7 @@
     <w:p>
       <w:r>
         <w:pict w14:anchorId="18D5D7E2">
-          <v:rect id="_x0000_i1095" style="width:0;height:1.5pt" o:hralign="center" o:hrstd="t" o:hr="t" fillcolor="#a0a0a0" stroked="f"/>
+          <v:rect id="_x0000_i1034" style="width:0;height:1.5pt" o:hralign="center" o:hrstd="t" o:hr="t" fillcolor="#a0a0a0" stroked="f"/>
         </w:pict>
       </w:r>
     </w:p>
@@ -3800,6 +3788,7 @@
   <w:style w:type="character" w:default="1" w:styleId="DefaultParagraphFont">
     <w:name w:val="Default Paragraph Font"/>
     <w:uiPriority w:val="1"/>
+    <w:semiHidden/>
     <w:unhideWhenUsed/>
   </w:style>
   <w:style w:type="table" w:default="1" w:styleId="TableNormal">

</xml_diff>

<commit_message>
Fixing MonthlyBudgetScreen.tsx dg logika kalukasi dan donat chart add back button add back button di walletlistscreen.tsx Mengubah teks section header "tabungan & target" menjadi tombol Adding SavingPlanScreen.tsx dan menempatkan di /saving.
</commit_message>
<xml_diff>
--- a/mockups/brief.docx
+++ b/mockups/brief.docx
@@ -1755,7 +1755,54 @@
     </w:p>
     <w:p>
       <w:r>
+        <w:lastRenderedPageBreak/>
         <w:br/>
+      </w:r>
+      <w:r>
+        <w:rPr>
+          <w:noProof/>
+        </w:rPr>
+        <w:drawing>
+          <wp:inline distT="0" distB="0" distL="0" distR="0" wp14:anchorId="79185E08" wp14:editId="479EED65">
+            <wp:extent cx="5731510" cy="8140700"/>
+            <wp:effectExtent l="0" t="0" r="0" b="0"/>
+            <wp:docPr id="4" name="Graphic 4"/>
+            <wp:cNvGraphicFramePr>
+              <a:graphicFrameLocks xmlns:a="http://schemas.openxmlformats.org/drawingml/2006/main" noChangeAspect="1"/>
+            </wp:cNvGraphicFramePr>
+            <a:graphic xmlns:a="http://schemas.openxmlformats.org/drawingml/2006/main">
+              <a:graphicData uri="http://schemas.openxmlformats.org/drawingml/2006/picture">
+                <pic:pic xmlns:pic="http://schemas.openxmlformats.org/drawingml/2006/picture">
+                  <pic:nvPicPr>
+                    <pic:cNvPr id="4" name="Graphic 4"/>
+                    <pic:cNvPicPr/>
+                  </pic:nvPicPr>
+                  <pic:blipFill>
+                    <a:blip r:embed="rId8">
+                      <a:extLst>
+                        <a:ext uri="{96DAC541-7B7A-43D3-8B79-37D633B846F1}">
+                          <asvg:svgBlip xmlns:asvg="http://schemas.microsoft.com/office/drawing/2016/SVG/main" r:embed="rId9"/>
+                        </a:ext>
+                      </a:extLst>
+                    </a:blip>
+                    <a:stretch>
+                      <a:fillRect/>
+                    </a:stretch>
+                  </pic:blipFill>
+                  <pic:spPr>
+                    <a:xfrm>
+                      <a:off x="0" y="0"/>
+                      <a:ext cx="5731510" cy="8140700"/>
+                    </a:xfrm>
+                    <a:prstGeom prst="rect">
+                      <a:avLst/>
+                    </a:prstGeom>
+                  </pic:spPr>
+                </pic:pic>
+              </a:graphicData>
+            </a:graphic>
+          </wp:inline>
+        </w:drawing>
       </w:r>
     </w:p>
     <w:sectPr>

</xml_diff>